<commit_message>
Drop framework version numbers across the site and CV, keep only the technology names
</commit_message>
<xml_diff>
--- a/public/cv/Nikola_Sepic_CV.docx
+++ b/public/cv/Nikola_Sepic_CV.docx
@@ -77,7 +77,7 @@
           <w:sz w:val="20"/>
           <w:szCs w:val="20"/>
         </w:rPr>
-        <w:t xml:space="preserve">Full-stack developer sa 1,5 godinom na produkcionim sistemima (Nuxt 4 i Laravel 12, ASP.NET Core 8, Rails 7) i praksom u digitalnom marketingu: 8 Google Ads kampanja za privatnu bolnicu i tehnički SEO koji je Site Health podigao sa 90% na 98%. Najjači u front-endu: TypeScript, React, Next.js, Vue.</w:t>
+        <w:t xml:space="preserve">Full-stack developer sa 1,5 godinom na produkcionim sistemima (Nuxt i Laravel, ASP.NET Core, Rails) i rezultatima u digitalnom marketingu: 8 Google Ads kampanja za privatnu bolnicu i tehnički SEO koji je Site Health podigao sa 90% na 98%. Najjači u front-endu: TypeScript, React, Next.js, Vue.</w:t>
       </w:r>
     </w:p>
     <w:p>
@@ -143,7 +143,7 @@
           <w:sz w:val="20"/>
           <w:szCs w:val="20"/>
         </w:rPr>
-        <w:t xml:space="preserve">React 19, Next.js 16, Vue 3, Nuxt 4, Tailwind CSS, HTML, CSS</w:t>
+        <w:t xml:space="preserve">React, Next.js, Vue, Nuxt, Tailwind CSS, HTML, CSS</w:t>
       </w:r>
     </w:p>
     <w:p>
@@ -166,7 +166,7 @@
           <w:sz w:val="20"/>
           <w:szCs w:val="20"/>
         </w:rPr>
-        <w:t xml:space="preserve">Node.js, Express, Laravel 12, ASP.NET Core 8, Rails 7, REST APIs, Auth (Better Auth, Clerk, Sanctum)</w:t>
+        <w:t xml:space="preserve">Node.js, Express, Laravel, ASP.NET Core, Rails, REST APIs, Auth (Better Auth, Clerk, Sanctum)</w:t>
       </w:r>
     </w:p>
     <w:p>
@@ -268,7 +268,7 @@
           <w:szCs w:val="19"/>
         </w:rPr>
         <w:tab/>
-        <w:t xml:space="preserve">avg 2025 – danas</w:t>
+        <w:t xml:space="preserve">feb 2025 – danas</w:t>
       </w:r>
     </w:p>
     <w:p>
@@ -284,7 +284,7 @@
           <w:sz w:val="18"/>
           <w:szCs w:val="18"/>
         </w:rPr>
-        <w:t xml:space="preserve">Beograd | Nuxt 4, Vue 3, TypeScript, Laravel 12, MySQL</w:t>
+        <w:t xml:space="preserve">Beograd | Nuxt, Vue, TypeScript, Laravel, MySQL</w:t>
       </w:r>
     </w:p>
     <w:p>
@@ -338,7 +338,7 @@
           <w:sz w:val="20"/>
           <w:szCs w:val="20"/>
         </w:rPr>
-        <w:t xml:space="preserve">Vodim i18n platforme od ~400 hiljada linija koda na 5 jezika, sa lokalizovanim URL-ovima (165 commit-a).</w:t>
+        <w:t xml:space="preserve">Vodim i18n platforme od ~400 hiljada linija koda na 5 jezika, sa lokalizovanim URL-ovima.</w:t>
       </w:r>
     </w:p>
     <w:p>
@@ -413,7 +413,7 @@
           <w:sz w:val="18"/>
           <w:szCs w:val="18"/>
         </w:rPr>
-        <w:t xml:space="preserve">Remote (SAD) | ASP.NET Core 8 MVC, Razor, Rails 7, Hotwire, Leaflet</w:t>
+        <w:t xml:space="preserve">Remote (SAD) | ASP.NET Core MVC, Razor, Rails, Hotwire, Leaflet</w:t>
       </w:r>
     </w:p>
     <w:p>
@@ -431,7 +431,7 @@
           <w:sz w:val="20"/>
           <w:szCs w:val="20"/>
         </w:rPr>
-        <w:t xml:space="preserve">Kao jedini UI developer u timu od 5, redizajnirao 40+ formi u TMS-u u modularne višestepene wizard-e.</w:t>
+        <w:t xml:space="preserve">Kao UI developer u timu od dva developera, redizajnirao 40+ formi u TMS-u u modularne višestepene wizard-e.</w:t>
       </w:r>
     </w:p>
     <w:p>
@@ -449,7 +449,7 @@
           <w:sz w:val="20"/>
           <w:szCs w:val="20"/>
         </w:rPr>
-        <w:t xml:space="preserve">Napravio živu Leaflet mapu pošiljke sa stanicama, lokacijom kamiona i ETA po stanici (Rails 7, Hotwire).</w:t>
+        <w:t xml:space="preserve">Napravio živu Leaflet mapu pošiljke sa stanicama, lokacijom kamiona i ETA po stanici (Rails, Hotwire).</w:t>
       </w:r>
     </w:p>
     <w:p>
@@ -524,7 +524,7 @@
           <w:sz w:val="18"/>
           <w:szCs w:val="18"/>
         </w:rPr>
-        <w:t xml:space="preserve">Beograd | Nuxt 4, Laravel 12, Google Ads, Meta Ads, GA4, GTM</w:t>
+        <w:t xml:space="preserve">Beograd | Nuxt, Laravel, Google Ads, Meta Ads, GA4, GTM</w:t>
       </w:r>
     </w:p>
     <w:p>
@@ -542,7 +542,7 @@
           <w:sz w:val="20"/>
           <w:szCs w:val="20"/>
         </w:rPr>
-        <w:t xml:space="preserve">Razvijam klijentsku platformu IT Expert (Nuxt 4, Laravel 12): portal, kalkulator cene, pretplate, Raiffeisen plaćanja.</w:t>
+        <w:t xml:space="preserve">Gradim klijentsku platformu IT Expert (Nuxt, Laravel): portal, pretplate i Raiffeisen naplata pokrivena sa 133 testa.</w:t>
       </w:r>
     </w:p>
     <w:p>
@@ -627,7 +627,7 @@
           <w:sz w:val="20"/>
           <w:szCs w:val="20"/>
         </w:rPr>
-        <w:t xml:space="preserve"> | Next.js 16, MongoDB, Better Auth: </w:t>
+        <w:t xml:space="preserve"> | Next.js, MongoDB, Better Auth: </w:t>
       </w:r>
       <w:r>
         <w:rPr>
@@ -659,7 +659,7 @@
           <w:sz w:val="20"/>
           <w:szCs w:val="20"/>
         </w:rPr>
-        <w:t xml:space="preserve"> | React 19, Express 5, Prisma: </w:t>
+        <w:t xml:space="preserve"> | React, Express, Prisma: </w:t>
       </w:r>
       <w:r>
         <w:rPr>

</xml_diff>